<commit_message>
Update Word document to strictly match exact 7-slide PDF submission template
</commit_message>
<xml_diff>
--- a/Honeywell_Idea_Submission_BehaviorIQ.docx
+++ b/Honeywell_Idea_Submission_BehaviorIQ.docx
@@ -4,42 +4,24 @@
   <w:body>
     <w:p>
       <w:pPr>
-        <w:pStyle w:val="Title"/>
-        <w:jc w:val="center"/>
-      </w:pPr>
-      <w:r>
-        <w:rPr>
-          <w:b/>
-          <w:color w:val="DC2626"/>
-          <w:sz w:val="44"/>
-        </w:rPr>
-        <w:t>HONEYWELL IDEA SUBMISSION</w:t>
-      </w:r>
-    </w:p>
-    <w:p>
-      <w:pPr>
-        <w:jc w:val="center"/>
-      </w:pPr>
-      <w:r>
-        <w:rPr>
-          <w:b/>
-          <w:sz w:val="26"/>
-        </w:rPr>
-        <w:t>BehaviorIQ: Autonomous Behavioral Anomaly Detection &amp; Threat SOC Engine</w:t>
-      </w:r>
-    </w:p>
-    <w:p/>
-    <w:p>
-      <w:pPr>
         <w:pStyle w:val="Heading1"/>
+        <w:jc w:val="left"/>
       </w:pPr>
       <w:r>
         <w:rPr>
           <w:b/>
           <w:color w:val="0F172A"/>
-          <w:sz w:val="32"/>
+          <w:sz w:val="40"/>
         </w:rPr>
-        <w:t>SLIDE 1: TITLE PAGE</w:t>
+        <w:t>IMPORTANT INSTRUCTIONS</w:t>
+      </w:r>
+    </w:p>
+    <w:p>
+      <w:r>
+        <w:rPr>
+          <w:b/>
+        </w:rPr>
+        <w:t>Please ensure below pointers are met while submitting the Idea PPT:</w:t>
       </w:r>
     </w:p>
     <w:p>
@@ -51,13 +33,7 @@
           <w:b/>
           <w:sz w:val="22"/>
         </w:rPr>
-        <w:t xml:space="preserve">Organization / Host: </w:t>
-      </w:r>
-      <w:r>
-        <w:rPr>
-          <w:sz w:val="22"/>
-        </w:rPr>
-        <w:t>Honeywell Hackathon Idea Submission</w:t>
+        <w:t>1. Kindly keep the maximum slides limit up to six (6). (Including the title slide)</w:t>
       </w:r>
     </w:p>
     <w:p>
@@ -69,13 +45,7 @@
           <w:b/>
           <w:sz w:val="22"/>
         </w:rPr>
-        <w:t xml:space="preserve">Problem Statement Title: </w:t>
-      </w:r>
-      <w:r>
-        <w:rPr>
-          <w:sz w:val="22"/>
-        </w:rPr>
-        <w:t>Autonomous Behavioral Anomaly Detection &amp; Threat SOC Engine for Enterprise IT &amp; Industrial OT</w:t>
+        <w:t>2. Try to avoid paragraphs and post your idea in points / diagrams / Infographics / pictures</w:t>
       </w:r>
     </w:p>
     <w:p>
@@ -87,13 +57,7 @@
           <w:b/>
           <w:sz w:val="22"/>
         </w:rPr>
-        <w:t xml:space="preserve">Theme: </w:t>
-      </w:r>
-      <w:r>
-        <w:rPr>
-          <w:sz w:val="22"/>
-        </w:rPr>
-        <w:t>Cybersecurity / Industrial OT Protection / AI &amp; ML</w:t>
+        <w:t>3. Keep your explanation precise and easy to understand</w:t>
       </w:r>
     </w:p>
     <w:p>
@@ -105,13 +69,7 @@
           <w:b/>
           <w:sz w:val="22"/>
         </w:rPr>
-        <w:t xml:space="preserve">Category: </w:t>
-      </w:r>
-      <w:r>
-        <w:rPr>
-          <w:sz w:val="22"/>
-        </w:rPr>
-        <w:t>Software</w:t>
+        <w:t>4. Idea should be unique and novel.</w:t>
       </w:r>
     </w:p>
     <w:p>
@@ -123,13 +81,7 @@
           <w:b/>
           <w:sz w:val="22"/>
         </w:rPr>
-        <w:t xml:space="preserve">Student / Presenter Name: </w:t>
-      </w:r>
-      <w:r>
-        <w:rPr>
-          <w:sz w:val="22"/>
-        </w:rPr>
-        <w:t>Yash Singh</w:t>
+        <w:t>5. You can only use provided template for making the PPT without changing the idea details pointers (mentioned in previous slides).</w:t>
       </w:r>
     </w:p>
     <w:p>
@@ -141,13 +93,16 @@
           <w:b/>
           <w:sz w:val="22"/>
         </w:rPr>
-        <w:t xml:space="preserve">Participant ID: </w:t>
+        <w:t>6. You need to save the file in PDF and upload the same on portal. No PPT, Word Doc or any other format will be supported.</w:t>
       </w:r>
+    </w:p>
+    <w:p>
       <w:r>
         <w:rPr>
-          <w:sz w:val="22"/>
+          <w:b/>
+          <w:color w:val="DC2626"/>
         </w:rPr>
-        <w:t>[Insert Your Registered ID Here]</w:t>
+        <w:t>Note - You can delete this slide (Important Pointers) when you upload the details of your idea portal.</w:t>
       </w:r>
     </w:p>
     <w:p>
@@ -158,30 +113,151 @@
     <w:p>
       <w:pPr>
         <w:pStyle w:val="Heading1"/>
+        <w:jc w:val="left"/>
       </w:pPr>
       <w:r>
         <w:rPr>
           <w:b/>
           <w:color w:val="0F172A"/>
-          <w:sz w:val="32"/>
+          <w:sz w:val="40"/>
         </w:rPr>
-        <w:t>SLIDE 2: IDEA TITLE &amp; PROPOSED SOLUTION</w:t>
+        <w:t>TITLE PAGE</w:t>
+      </w:r>
+    </w:p>
+    <w:p>
+      <w:pPr>
+        <w:pStyle w:val="ListBullet"/>
+      </w:pPr>
+      <w:r>
+        <w:rPr>
+          <w:b/>
+          <w:sz w:val="22"/>
+        </w:rPr>
+        <w:t>Problem Statement ID –</w:t>
+      </w:r>
+      <w:r>
+        <w:rPr>
+          <w:sz w:val="22"/>
+        </w:rPr>
+        <w:t xml:space="preserve"> [Insert Your PS ID e.g., SIH1234 / HW_SEC_01]</w:t>
+      </w:r>
+    </w:p>
+    <w:p>
+      <w:pPr>
+        <w:pStyle w:val="ListBullet"/>
+      </w:pPr>
+      <w:r>
+        <w:rPr>
+          <w:b/>
+          <w:sz w:val="22"/>
+        </w:rPr>
+        <w:t>Problem Statement Title-</w:t>
+      </w:r>
+      <w:r>
+        <w:rPr>
+          <w:sz w:val="22"/>
+        </w:rPr>
+        <w:t xml:space="preserve"> Autonomous Behavioral Anomaly Detection &amp; Threat SOC Engine for Enterprise IT &amp; Industrial OT</w:t>
+      </w:r>
+    </w:p>
+    <w:p>
+      <w:pPr>
+        <w:pStyle w:val="ListBullet"/>
+      </w:pPr>
+      <w:r>
+        <w:rPr>
+          <w:b/>
+          <w:sz w:val="22"/>
+        </w:rPr>
+        <w:t>Theme-</w:t>
+      </w:r>
+      <w:r>
+        <w:rPr>
+          <w:sz w:val="22"/>
+        </w:rPr>
+        <w:t xml:space="preserve"> Cybersecurity / AI &amp; ML / Smart Industrial Automation</w:t>
+      </w:r>
+    </w:p>
+    <w:p>
+      <w:pPr>
+        <w:pStyle w:val="ListBullet"/>
+      </w:pPr>
+      <w:r>
+        <w:rPr>
+          <w:b/>
+          <w:sz w:val="22"/>
+        </w:rPr>
+        <w:t>PS Category-</w:t>
+      </w:r>
+      <w:r>
+        <w:rPr>
+          <w:sz w:val="22"/>
+        </w:rPr>
+        <w:t xml:space="preserve"> Software</w:t>
+      </w:r>
+    </w:p>
+    <w:p>
+      <w:pPr>
+        <w:pStyle w:val="ListBullet"/>
+      </w:pPr>
+      <w:r>
+        <w:rPr>
+          <w:b/>
+          <w:sz w:val="22"/>
+        </w:rPr>
+        <w:t>Student Name (Registered on portal)-</w:t>
+      </w:r>
+      <w:r>
+        <w:rPr>
+          <w:sz w:val="22"/>
+        </w:rPr>
+        <w:t xml:space="preserve"> Yash Singh</w:t>
+      </w:r>
+    </w:p>
+    <w:p>
+      <w:pPr>
+        <w:pStyle w:val="ListBullet"/>
+      </w:pPr>
+      <w:r>
+        <w:rPr>
+          <w:b/>
+          <w:sz w:val="22"/>
+        </w:rPr>
+        <w:t>Student ID-</w:t>
+      </w:r>
+      <w:r>
+        <w:rPr>
+          <w:sz w:val="22"/>
+        </w:rPr>
+        <w:t xml:space="preserve"> [Insert Your Registered Portal Student ID]</w:t>
+      </w:r>
+    </w:p>
+    <w:p>
+      <w:r>
+        <w:br w:type="page"/>
+      </w:r>
+    </w:p>
+    <w:p>
+      <w:pPr>
+        <w:pStyle w:val="Heading1"/>
+        <w:jc w:val="left"/>
+      </w:pPr>
+      <w:r>
+        <w:rPr>
+          <w:b/>
+          <w:color w:val="0F172A"/>
+          <w:sz w:val="40"/>
+        </w:rPr>
+        <w:t>IDEA TITLE: BehaviorIQ</w:t>
       </w:r>
     </w:p>
     <w:p>
       <w:r>
         <w:rPr>
           <w:b/>
-          <w:sz w:val="24"/>
+          <w:sz w:val="28"/>
+          <w:u w:val="single"/>
         </w:rPr>
-        <w:t>Idea Title: BehaviorIQ — Autonomous AI-Powered Behavioral Threat Engine</w:t>
-      </w:r>
-    </w:p>
-    <w:p>
-      <w:pPr>
-        <w:pStyle w:val="Heading2"/>
-      </w:pPr>
-      <w:r>
         <w:t>Proposed Solution (Describe your Idea/Solution/Prototype)</w:t>
       </w:r>
     </w:p>
@@ -194,13 +270,61 @@
           <w:b/>
           <w:sz w:val="22"/>
         </w:rPr>
-        <w:t xml:space="preserve">Detailed Explanation: </w:t>
+        <w:t>Detailed explanation of the proposed solution:</w:t>
+      </w:r>
+    </w:p>
+    <w:p>
+      <w:pPr>
+        <w:pStyle w:val="ListBullet2"/>
+      </w:pPr>
+      <w:r>
+        <w:rPr>
+          <w:b/>
+          <w:sz w:val="21"/>
+        </w:rPr>
+        <w:t>• Autonomous Behavioral SOC Engine:</w:t>
       </w:r>
       <w:r>
         <w:rPr>
-          <w:sz w:val="22"/>
+          <w:sz w:val="21"/>
         </w:rPr>
-        <w:t>BehaviorIQ is an autonomous AI-powered Security Operations Center (SOC) engine that replaces static SIEM alert rules with dynamic, per-entity machine learning baselines. It analyzes real-time stream logs (1,420+ events/sec) across users, service accounts, and Honeywell edge devices to detect novel zero-day intrusions.</w:t>
+        <w:t xml:space="preserve"> Replaces static SIEM alert rules with dynamic, per-entity machine learning baselines to detect novel zero-day intrusions.</w:t>
+      </w:r>
+    </w:p>
+    <w:p>
+      <w:pPr>
+        <w:pStyle w:val="ListBullet2"/>
+      </w:pPr>
+      <w:r>
+        <w:rPr>
+          <w:b/>
+          <w:sz w:val="21"/>
+        </w:rPr>
+        <w:t>• Dual-Stage ML Architecture:</w:t>
+      </w:r>
+      <w:r>
+        <w:rPr>
+          <w:sz w:val="21"/>
+        </w:rPr>
+        <w:t xml:space="preserve"> Combines an Unsupervised Isolation Forest Profiler (5,000 decision trees) for anomaly scoring [0-100] with a Multi-Class LightGBM Classifier for threat taxonomy assignment.</w:t>
+      </w:r>
+    </w:p>
+    <w:p>
+      <w:pPr>
+        <w:pStyle w:val="ListBullet2"/>
+      </w:pPr>
+      <w:r>
+        <w:rPr>
+          <w:b/>
+          <w:sz w:val="21"/>
+        </w:rPr>
+        <w:t>• Explainable AI (SHAP XAI):</w:t>
+      </w:r>
+      <w:r>
+        <w:rPr>
+          <w:sz w:val="21"/>
+        </w:rPr>
+        <w:t xml:space="preserve"> Provides SHAP feature attribution leaderboards and natural-language forensic narratives for every flagged alert.</w:t>
       </w:r>
     </w:p>
     <w:p>
@@ -212,13 +336,61 @@
           <w:b/>
           <w:sz w:val="22"/>
         </w:rPr>
-        <w:t xml:space="preserve">Addressing Alert Fatigue: </w:t>
+        <w:t>How it addresses the problem:</w:t>
+      </w:r>
+    </w:p>
+    <w:p>
+      <w:pPr>
+        <w:pStyle w:val="ListBullet2"/>
+      </w:pPr>
+      <w:r>
+        <w:rPr>
+          <w:b/>
+          <w:sz w:val="21"/>
+        </w:rPr>
+        <w:t>• Eliminates SOC Alert Fatigue:</w:t>
       </w:r>
       <w:r>
         <w:rPr>
-          <w:sz w:val="22"/>
+          <w:sz w:val="21"/>
         </w:rPr>
-        <w:t>Enforces a strict Top 1% Alert Budget (&gt;= 75.0 Risk Score), filtering out 99% of benign noise to eliminate analyst alert fatigue.</w:t>
+        <w:t xml:space="preserve"> Enforces a strict Top 1% Alert Budget (&gt;= 75.0 Risk Score), filtering out 99% of benign false positive noise.</w:t>
+      </w:r>
+    </w:p>
+    <w:p>
+      <w:pPr>
+        <w:pStyle w:val="ListBullet2"/>
+      </w:pPr>
+      <w:r>
+        <w:rPr>
+          <w:b/>
+          <w:sz w:val="21"/>
+        </w:rPr>
+        <w:t>• Sub-Second Mitigation Response:</w:t>
+      </w:r>
+      <w:r>
+        <w:rPr>
+          <w:sz w:val="21"/>
+        </w:rPr>
+        <w:t xml:space="preserve"> Executes autonomous playbooks (Cloudflare WAF IP quarantine, OAuth2 token revocation, mandatory MFA) in &lt; 0.38 seconds.</w:t>
+      </w:r>
+    </w:p>
+    <w:p>
+      <w:pPr>
+        <w:pStyle w:val="ListBullet2"/>
+      </w:pPr>
+      <w:r>
+        <w:rPr>
+          <w:b/>
+          <w:sz w:val="21"/>
+        </w:rPr>
+        <w:t>• Solves Edge Cases:</w:t>
+      </w:r>
+      <w:r>
+        <w:rPr>
+          <w:sz w:val="21"/>
+        </w:rPr>
+        <w:t xml:space="preserve"> Employs Hierarchical Bayesian Blending for Cold-Start entities (N &lt; 20 events) and Exponential Moving Average (EMA alpha = 0.05) for Concept Drift adaptation.</w:t>
       </w:r>
     </w:p>
     <w:p>
@@ -230,13 +402,62 @@
           <w:b/>
           <w:sz w:val="22"/>
         </w:rPr>
-        <w:t xml:space="preserve">Sub-Second Response: </w:t>
+        <w:t>Innovation and uniqueness of the solution:</w:t>
+      </w:r>
+    </w:p>
+    <w:p>
+      <w:pPr>
+        <w:pStyle w:val="ListBullet2"/>
+      </w:pPr>
+      <w:r>
+        <w:rPr>
+          <w:b/>
+          <w:sz w:val="21"/>
+        </w:rPr>
+        <w:t>• Real-Time Geo-Velocity Tracking:</w:t>
       </w:r>
       <w:r>
         <w:rPr>
-          <w:sz w:val="22"/>
+          <w:sz w:val="21"/>
         </w:rPr>
-        <w:t>Executes autonomous mitigation playbooks (Cloudflare WAF IP quarantine, OAuth2 token revocation, mandatory MFA) in &lt;0.38 seconds.</w:t>
+        <w:t xml:space="preserve"> Calculates physical travel speed (&gt; 840 km/h) between consecutive access tokens to stop impossible travel intrusions.</w:t>
+      </w:r>
+    </w:p>
+    <w:p>
+      <w:pPr>
+        <w:pStyle w:val="ListBullet2"/>
+      </w:pPr>
+      <w:r>
+        <w:rPr>
+          <w:b/>
+          <w:sz w:val="21"/>
+        </w:rPr>
+        <w:t>• Dark Web Intelligence Integration:</w:t>
+      </w:r>
+      <w:r>
+        <w:rPr>
+          <w:sz w:val="21"/>
+        </w:rPr>
+        <w:t xml:space="preserve"> Live cross-referencing of entity session tokens against active dark web credential dumps and breach databases.</w:t>
+      </w:r>
+    </w:p>
+    <w:p>
+      <w:r>
+        <w:br w:type="page"/>
+      </w:r>
+    </w:p>
+    <w:p>
+      <w:pPr>
+        <w:pStyle w:val="Heading1"/>
+        <w:jc w:val="left"/>
+      </w:pPr>
+      <w:r>
+        <w:rPr>
+          <w:b/>
+          <w:color w:val="0F172A"/>
+          <w:sz w:val="40"/>
+        </w:rPr>
+        <w:t>TECHNICAL APPROACH</w:t>
       </w:r>
     </w:p>
     <w:p>
@@ -248,39 +469,97 @@
           <w:b/>
           <w:sz w:val="22"/>
         </w:rPr>
-        <w:t xml:space="preserve">Innovation &amp; Uniqueness: </w:t>
-      </w:r>
-      <w:r>
-        <w:rPr>
-          <w:sz w:val="22"/>
-        </w:rPr>
-        <w:t>Explainable AI (SHAP XAI) provides feature attributions and natural-language narratives for every alert. Integrated dark web breach intelligence cross-references compromised credentials.</w:t>
-      </w:r>
-    </w:p>
-    <w:p>
-      <w:r>
-        <w:br w:type="page"/>
+        <w:t>Technologies to be used (e.g. programming languages, frameworks, hardware):</w:t>
       </w:r>
     </w:p>
     <w:p>
       <w:pPr>
-        <w:pStyle w:val="Heading1"/>
+        <w:pStyle w:val="ListBullet2"/>
       </w:pPr>
       <w:r>
         <w:rPr>
           <w:b/>
-          <w:color w:val="0F172A"/>
-          <w:sz w:val="32"/>
+          <w:sz w:val="21"/>
         </w:rPr>
-        <w:t>SLIDE 3: TECHNICAL APPROACH</w:t>
+        <w:t>• Languages &amp; Backend Frameworks:</w:t>
+      </w:r>
+      <w:r>
+        <w:rPr>
+          <w:sz w:val="21"/>
+        </w:rPr>
+        <w:t xml:space="preserve"> Python 3.11, FastAPI REST Framework, Uvicorn, Gunicorn WSGI.</w:t>
       </w:r>
     </w:p>
     <w:p>
       <w:pPr>
-        <w:pStyle w:val="Heading2"/>
+        <w:pStyle w:val="ListBullet2"/>
       </w:pPr>
       <w:r>
-        <w:t>Technologies to be used</w:t>
+        <w:rPr>
+          <w:b/>
+          <w:sz w:val="21"/>
+        </w:rPr>
+        <w:t>• Machine Learning &amp; Explainability:</w:t>
+      </w:r>
+      <w:r>
+        <w:rPr>
+          <w:sz w:val="21"/>
+        </w:rPr>
+        <w:t xml:space="preserve"> Scikit-Learn (Isolation Forest), LightGBM (Multi-Class Gradient Boosting), SHAP (SHapley Additive exPlanations), NumPy, Pandas.</w:t>
+      </w:r>
+    </w:p>
+    <w:p>
+      <w:pPr>
+        <w:pStyle w:val="ListBullet2"/>
+      </w:pPr>
+      <w:r>
+        <w:rPr>
+          <w:b/>
+          <w:sz w:val="21"/>
+        </w:rPr>
+        <w:t>• Distributed Streaming &amp; Storage:</w:t>
+      </w:r>
+      <w:r>
+        <w:rPr>
+          <w:sz w:val="21"/>
+        </w:rPr>
+        <w:t xml:space="preserve"> Apache Kafka Event Broker (1,420+ eps), Redis Feature Store Cache (&lt;0.2ms latency).</w:t>
+      </w:r>
+    </w:p>
+    <w:p>
+      <w:pPr>
+        <w:pStyle w:val="ListBullet2"/>
+      </w:pPr>
+      <w:r>
+        <w:rPr>
+          <w:b/>
+          <w:sz w:val="21"/>
+        </w:rPr>
+        <w:t>• Frontend Interface:</w:t>
+      </w:r>
+      <w:r>
+        <w:rPr>
+          <w:sz w:val="21"/>
+        </w:rPr>
+        <w:t xml:space="preserve"> Glassmorphism HTML5 Canvas, Tailwind CSS v3, Chart.js, Web Audio API.</w:t>
+      </w:r>
+    </w:p>
+    <w:p>
+      <w:pPr>
+        <w:pStyle w:val="ListBullet2"/>
+      </w:pPr>
+      <w:r>
+        <w:rPr>
+          <w:b/>
+          <w:sz w:val="21"/>
+        </w:rPr>
+        <w:t>• Cloud &amp; Orchestration:</w:t>
+      </w:r>
+      <w:r>
+        <w:rPr>
+          <w:sz w:val="21"/>
+        </w:rPr>
+        <w:t xml:space="preserve"> Docker, Docker Compose, Kubernetes HPA (Autoscaling), Vercel (Frontend), Render (Backend).</w:t>
       </w:r>
     </w:p>
     <w:p>
@@ -292,13 +571,116 @@
           <w:b/>
           <w:sz w:val="22"/>
         </w:rPr>
-        <w:t xml:space="preserve">Machine Learning Core: </w:t>
+        <w:t>Methodology and process for implementation (Flow Charts/Images/ working prototype):</w:t>
+      </w:r>
+    </w:p>
+    <w:p>
+      <w:pPr>
+        <w:pStyle w:val="ListBullet2"/>
+      </w:pPr>
+      <w:r>
+        <w:rPr>
+          <w:b/>
+          <w:sz w:val="21"/>
+        </w:rPr>
+        <w:t>• Ingestion &amp; Feature Engineering Pipeline:</w:t>
       </w:r>
       <w:r>
         <w:rPr>
-          <w:sz w:val="22"/>
+          <w:sz w:val="21"/>
         </w:rPr>
-        <w:t>Scikit-Learn (Isolation Forest - 5,000 decision trees) + LightGBM Multi-Class Classifier + SHAP Explainability.</w:t>
+        <w:t xml:space="preserve"> Access Stream Logs ➔ Extract Geo-Velocity, Failed Login Bursts, Device Hash ➔ Stateful Feature Matrix.</w:t>
+      </w:r>
+    </w:p>
+    <w:p>
+      <w:pPr>
+        <w:pStyle w:val="ListBullet2"/>
+      </w:pPr>
+      <w:r>
+        <w:rPr>
+          <w:b/>
+          <w:sz w:val="21"/>
+        </w:rPr>
+        <w:t>• Unsupervised Profiling &amp; Scoring:</w:t>
+      </w:r>
+      <w:r>
+        <w:rPr>
+          <w:sz w:val="21"/>
+        </w:rPr>
+        <w:t xml:space="preserve"> Feature Matrix ➔ Isolation Forest (5,000 Trees) ➔ Normalized Anomaly Score [0-100].</w:t>
+      </w:r>
+    </w:p>
+    <w:p>
+      <w:pPr>
+        <w:pStyle w:val="ListBullet2"/>
+      </w:pPr>
+      <w:r>
+        <w:rPr>
+          <w:b/>
+          <w:sz w:val="21"/>
+        </w:rPr>
+        <w:t>• Top 1% Alert Budget Filter:</w:t>
+      </w:r>
+      <w:r>
+        <w:rPr>
+          <w:sz w:val="21"/>
+        </w:rPr>
+        <w:t xml:space="preserve"> Score &gt;= 75.0 ? Flag Threat : Update EMA Baseline Profile (alpha = 0.05).</w:t>
+      </w:r>
+    </w:p>
+    <w:p>
+      <w:pPr>
+        <w:pStyle w:val="ListBullet2"/>
+      </w:pPr>
+      <w:r>
+        <w:rPr>
+          <w:b/>
+          <w:sz w:val="21"/>
+        </w:rPr>
+        <w:t>• Classification &amp; Explainability:</w:t>
+      </w:r>
+      <w:r>
+        <w:rPr>
+          <w:sz w:val="21"/>
+        </w:rPr>
+        <w:t xml:space="preserve"> Flagged Anomaly ➔ LightGBM Classifier ➔ SHAP Feature Importance Attribution ➔ Analyst Triage Desk.</w:t>
+      </w:r>
+    </w:p>
+    <w:p>
+      <w:pPr>
+        <w:pStyle w:val="ListBullet2"/>
+      </w:pPr>
+      <w:r>
+        <w:rPr>
+          <w:b/>
+          <w:sz w:val="21"/>
+        </w:rPr>
+        <w:t>• Autonomous SOAR Playbook:</w:t>
+      </w:r>
+      <w:r>
+        <w:rPr>
+          <w:sz w:val="21"/>
+        </w:rPr>
+        <w:t xml:space="preserve"> High Confidence Threat ➔ Execute Cloudflare WAF IP Block &amp; OAuth Token Revocation (&lt;0.38s).</w:t>
+      </w:r>
+    </w:p>
+    <w:p>
+      <w:r>
+        <w:br w:type="page"/>
+      </w:r>
+    </w:p>
+    <w:p>
+      <w:pPr>
+        <w:pStyle w:val="Heading1"/>
+        <w:jc w:val="left"/>
+      </w:pPr>
+      <w:r>
+        <w:rPr>
+          <w:b/>
+          <w:color w:val="0F172A"/>
+          <w:sz w:val="40"/>
+        </w:rPr>
+        <w:t>FEASIBILITY AND VIABILITY</w:t>
       </w:r>
     </w:p>
     <w:p>
@@ -310,13 +692,61 @@
           <w:b/>
           <w:sz w:val="22"/>
         </w:rPr>
-        <w:t xml:space="preserve">Backend REST Infrastructure: </w:t>
+        <w:t>Analysis of the feasibility of the idea:</w:t>
+      </w:r>
+    </w:p>
+    <w:p>
+      <w:pPr>
+        <w:pStyle w:val="ListBullet2"/>
+      </w:pPr>
+      <w:r>
+        <w:rPr>
+          <w:b/>
+          <w:sz w:val="21"/>
+        </w:rPr>
+        <w:t>• Empirical ML Benchmark Scores:</w:t>
       </w:r>
       <w:r>
         <w:rPr>
-          <w:sz w:val="22"/>
+          <w:sz w:val="21"/>
         </w:rPr>
-        <w:t>Python 3.11, FastAPI REST Framework, Uvicorn, Gunicorn, Apache Kafka Stream Broker, Redis Feature Store Cache.</w:t>
+        <w:t xml:space="preserve"> Binary Anomaly F1-Score = 0.961, Precision = 0.972, Recall = 0.951.</w:t>
+      </w:r>
+    </w:p>
+    <w:p>
+      <w:pPr>
+        <w:pStyle w:val="ListBullet2"/>
+      </w:pPr>
+      <w:r>
+        <w:rPr>
+          <w:b/>
+          <w:sz w:val="21"/>
+        </w:rPr>
+        <w:t>• Real-Time Latency Benchmark:</w:t>
+      </w:r>
+      <w:r>
+        <w:rPr>
+          <w:sz w:val="21"/>
+        </w:rPr>
+        <w:t xml:space="preserve"> Model inference completes in &lt; 0.8ms per event, handling &gt; 12,000 events/sec throughput.</w:t>
+      </w:r>
+    </w:p>
+    <w:p>
+      <w:pPr>
+        <w:pStyle w:val="ListBullet2"/>
+      </w:pPr>
+      <w:r>
+        <w:rPr>
+          <w:b/>
+          <w:sz w:val="21"/>
+        </w:rPr>
+        <w:t>• False Positive Rate Target:</w:t>
+      </w:r>
+      <w:r>
+        <w:rPr>
+          <w:sz w:val="21"/>
+        </w:rPr>
+        <w:t xml:space="preserve"> Top 1% Alert Budget enforcement maintains FPR &lt; 0.32%, well below the industry standard limit.</w:t>
       </w:r>
     </w:p>
     <w:p>
@@ -328,13 +758,43 @@
           <w:b/>
           <w:sz w:val="22"/>
         </w:rPr>
-        <w:t xml:space="preserve">Frontend &amp; Data Viz: </w:t>
+        <w:t>Potential challenges and risks:</w:t>
+      </w:r>
+    </w:p>
+    <w:p>
+      <w:pPr>
+        <w:pStyle w:val="ListBullet2"/>
+      </w:pPr>
+      <w:r>
+        <w:rPr>
+          <w:b/>
+          <w:sz w:val="21"/>
+        </w:rPr>
+        <w:t>• Cold-Start Challenge:</w:t>
       </w:r>
       <w:r>
         <w:rPr>
-          <w:sz w:val="22"/>
+          <w:sz w:val="21"/>
         </w:rPr>
-        <w:t>Glassmorphism HTML5 Canvas, Tailwind CSS v3, Chart.js, Web Audio API.</w:t>
+        <w:t xml:space="preserve"> Newly onboarded users or IoT devices (N &lt; 20 events) lack behavioral history, risking false positive storms.</w:t>
+      </w:r>
+    </w:p>
+    <w:p>
+      <w:pPr>
+        <w:pStyle w:val="ListBullet2"/>
+      </w:pPr>
+      <w:r>
+        <w:rPr>
+          <w:b/>
+          <w:sz w:val="21"/>
+        </w:rPr>
+        <w:t>• Concept Drift Risk:</w:t>
+      </w:r>
+      <w:r>
+        <w:rPr>
+          <w:sz w:val="21"/>
+        </w:rPr>
+        <w:t xml:space="preserve"> Legitimate evolving employee behavior (e.g. shift change) causing false baseline drift over time.</w:t>
       </w:r>
     </w:p>
     <w:p>
@@ -346,29 +806,43 @@
           <w:b/>
           <w:sz w:val="22"/>
         </w:rPr>
-        <w:t xml:space="preserve">Cloud Orchestration: </w:t>
-      </w:r>
-      <w:r>
-        <w:rPr>
-          <w:sz w:val="22"/>
-        </w:rPr>
-        <w:t>Docker, Docker Compose, Kubernetes HPA, Vercel (Frontend), Render (Backend).</w:t>
+        <w:t>Strategies for overcoming these challenges:</w:t>
       </w:r>
     </w:p>
     <w:p>
       <w:pPr>
-        <w:pStyle w:val="Heading2"/>
+        <w:pStyle w:val="ListBullet2"/>
       </w:pPr>
       <w:r>
-        <w:t>Methodology and Implementation Pipeline</w:t>
+        <w:rPr>
+          <w:b/>
+          <w:sz w:val="21"/>
+        </w:rPr>
+        <w:t>• Hierarchical Bayesian Blending:</w:t>
+      </w:r>
+      <w:r>
+        <w:rPr>
+          <w:sz w:val="21"/>
+        </w:rPr>
+        <w:t xml:space="preserve"> Blends population priors (user vs service_account vs edge_device) with empirical stats, reducing cold-start FPR to 0.85%.</w:t>
       </w:r>
     </w:p>
     <w:p>
+      <w:pPr>
+        <w:pStyle w:val="ListBullet2"/>
+      </w:pPr>
       <w:r>
         <w:rPr>
-          <w:sz w:val="20"/>
+          <w:b/>
+          <w:sz w:val="21"/>
         </w:rPr>
-        <w:t>Real-Time Log Stream (1,420 eps) ➔ Feature Engineering (Geo-Velocity &gt;840 km/h, Failed Logins/5m) ➔ Isolation Forest Profiler (5,000 Trees -&gt; 0-100 Risk Score) ➔ Top 1% Alert Budget Filter (FPR 0.32%) ➔ LightGBM Classifier ➔ SHAP Attribution Narrative ➔ Autonomous WAF Block (&lt;0.38s)</w:t>
+        <w:t>• EMA Baseline Adaptation (alpha = 0.05):</w:t>
+      </w:r>
+      <w:r>
+        <w:rPr>
+          <w:sz w:val="21"/>
+        </w:rPr>
+        <w:t xml:space="preserve"> Continuously updates non-anomalous baseline centroids without requiring expensive full-model retraining.</w:t>
       </w:r>
     </w:p>
     <w:p>
@@ -379,22 +853,15 @@
     <w:p>
       <w:pPr>
         <w:pStyle w:val="Heading1"/>
+        <w:jc w:val="left"/>
       </w:pPr>
       <w:r>
         <w:rPr>
           <w:b/>
           <w:color w:val="0F172A"/>
-          <w:sz w:val="32"/>
+          <w:sz w:val="40"/>
         </w:rPr>
-        <w:t>SLIDE 4: FEASIBILITY AND VIABILITY</w:t>
-      </w:r>
-    </w:p>
-    <w:p>
-      <w:pPr>
-        <w:pStyle w:val="Heading2"/>
-      </w:pPr>
-      <w:r>
-        <w:t>Feasibility Analysis</w:t>
+        <w:t>ARTIFACTS</w:t>
       </w:r>
     </w:p>
     <w:p>
@@ -406,13 +873,7 @@
           <w:b/>
           <w:sz w:val="22"/>
         </w:rPr>
-        <w:t xml:space="preserve">Proven Model Accuracy: </w:t>
-      </w:r>
-      <w:r>
-        <w:rPr>
-          <w:sz w:val="22"/>
-        </w:rPr>
-        <w:t>Binary Anomaly F1-Score = 0.961, Precision = 0.972, Recall = 0.951.</w:t>
+        <w:t>Relevant artifacts, such as :</w:t>
       </w:r>
     </w:p>
     <w:p>
@@ -424,21 +885,61 @@
           <w:b/>
           <w:sz w:val="22"/>
         </w:rPr>
-        <w:t xml:space="preserve">Ultra-Low Latency: </w:t>
-      </w:r>
-      <w:r>
-        <w:rPr>
-          <w:sz w:val="22"/>
-        </w:rPr>
-        <w:t>Machine learning inference completes in &lt; 0.8ms per event, guaranteeing real-time streaming feasibility.</w:t>
+        <w:t>Copy of the Code Embedded:</w:t>
       </w:r>
     </w:p>
     <w:p>
       <w:pPr>
-        <w:pStyle w:val="Heading2"/>
+        <w:pStyle w:val="ListBullet2"/>
       </w:pPr>
       <w:r>
-        <w:t>Potential Challenges &amp; Risks</w:t>
+        <w:rPr>
+          <w:b/>
+          <w:sz w:val="21"/>
+        </w:rPr>
+        <w:t>• GitHub Repository:</w:t>
+      </w:r>
+      <w:r>
+        <w:rPr>
+          <w:sz w:val="21"/>
+        </w:rPr>
+        <w:t xml:space="preserve"> https://github.com/Yash-Singh607/Behavior-IQ</w:t>
+      </w:r>
+    </w:p>
+    <w:p>
+      <w:pPr>
+        <w:pStyle w:val="ListBullet2"/>
+      </w:pPr>
+      <w:r>
+        <w:rPr>
+          <w:b/>
+          <w:sz w:val="21"/>
+        </w:rPr>
+        <w:t>• Containerization:</w:t>
+      </w:r>
+      <w:r>
+        <w:rPr>
+          <w:sz w:val="21"/>
+        </w:rPr>
+        <w:t xml:space="preserve"> Dockerfile (512MB RAM optimized), docker-compose.yml (API, Redis, Kafka).</w:t>
+      </w:r>
+    </w:p>
+    <w:p>
+      <w:pPr>
+        <w:pStyle w:val="ListBullet2"/>
+      </w:pPr>
+      <w:r>
+        <w:rPr>
+          <w:b/>
+          <w:sz w:val="21"/>
+        </w:rPr>
+        <w:t>• Kubernetes Manifests:</w:t>
+      </w:r>
+      <w:r>
+        <w:rPr>
+          <w:sz w:val="21"/>
+        </w:rPr>
+        <w:t xml:space="preserve"> deploy/k8s/deployment.yaml (Deployment, LoadBalancer Service, Horizontal Pod Autoscaler).</w:t>
       </w:r>
     </w:p>
     <w:p>
@@ -450,13 +951,79 @@
           <w:b/>
           <w:sz w:val="22"/>
         </w:rPr>
-        <w:t xml:space="preserve">Cold-Start Problem: </w:t>
+        <w:t>Snaps of the solution proposal &amp; Live Cloud Links:</w:t>
+      </w:r>
+    </w:p>
+    <w:p>
+      <w:pPr>
+        <w:pStyle w:val="ListBullet2"/>
+      </w:pPr>
+      <w:r>
+        <w:rPr>
+          <w:b/>
+          <w:sz w:val="21"/>
+        </w:rPr>
+        <w:t>• Live Vercel Frontend UI:</w:t>
       </w:r>
       <w:r>
         <w:rPr>
-          <w:sz w:val="22"/>
+          <w:sz w:val="21"/>
         </w:rPr>
-        <w:t>Newly onboarded users/devices (N &lt; 20 events) triggering false positive storms.</w:t>
+        <w:t xml:space="preserve"> https://behavior-iq-jade.vercel.app</w:t>
+      </w:r>
+    </w:p>
+    <w:p>
+      <w:pPr>
+        <w:pStyle w:val="ListBullet2"/>
+      </w:pPr>
+      <w:r>
+        <w:rPr>
+          <w:b/>
+          <w:sz w:val="21"/>
+        </w:rPr>
+        <w:t>• Live Render FastAPI Backend:</w:t>
+      </w:r>
+      <w:r>
+        <w:rPr>
+          <w:sz w:val="21"/>
+        </w:rPr>
+        <w:t xml:space="preserve"> https://behavior-iq.onrender.com</w:t>
+      </w:r>
+    </w:p>
+    <w:p>
+      <w:pPr>
+        <w:pStyle w:val="ListBullet2"/>
+      </w:pPr>
+      <w:r>
+        <w:rPr>
+          <w:b/>
+          <w:sz w:val="21"/>
+        </w:rPr>
+        <w:t>• Interactive Swagger API Docs:</w:t>
+      </w:r>
+      <w:r>
+        <w:rPr>
+          <w:sz w:val="21"/>
+        </w:rPr>
+        <w:t xml:space="preserve"> https://behavior-iq.onrender.com/docs</w:t>
+      </w:r>
+    </w:p>
+    <w:p>
+      <w:pPr>
+        <w:pStyle w:val="ListBullet2"/>
+      </w:pPr>
+      <w:r>
+        <w:rPr>
+          <w:b/>
+          <w:sz w:val="21"/>
+        </w:rPr>
+        <w:t>• Live Analyst Testing Credentials:</w:t>
+      </w:r>
+      <w:r>
+        <w:rPr>
+          <w:sz w:val="21"/>
+        </w:rPr>
+        <w:t xml:space="preserve"> Email: admin@behavioriq.ai | Password: admin123</w:t>
       </w:r>
     </w:p>
     <w:p>
@@ -468,21 +1035,80 @@
           <w:b/>
           <w:sz w:val="22"/>
         </w:rPr>
-        <w:t xml:space="preserve">Concept Drift: </w:t>
-      </w:r>
-      <w:r>
-        <w:rPr>
-          <w:sz w:val="22"/>
-        </w:rPr>
-        <w:t>Legitimate evolving behavior over time causing baseline drift.</w:t>
+        <w:t>Dashboard snaps:</w:t>
       </w:r>
     </w:p>
     <w:p>
       <w:pPr>
-        <w:pStyle w:val="Heading2"/>
+        <w:pStyle w:val="ListBullet2"/>
       </w:pPr>
       <w:r>
-        <w:t>Overcoming Strategies</w:t>
+        <w:rPr>
+          <w:b/>
+          <w:sz w:val="21"/>
+        </w:rPr>
+        <w:t>• Real-Time Incident Triage Desk:</w:t>
+      </w:r>
+      <w:r>
+        <w:rPr>
+          <w:sz w:val="21"/>
+        </w:rPr>
+        <w:t xml:space="preserve"> Interactive triage stream table with SHAP feature attributions.</w:t>
+      </w:r>
+    </w:p>
+    <w:p>
+      <w:pPr>
+        <w:pStyle w:val="ListBullet2"/>
+      </w:pPr>
+      <w:r>
+        <w:rPr>
+          <w:b/>
+          <w:sz w:val="21"/>
+        </w:rPr>
+        <w:t>• Stage Threat Injection Simulator:</w:t>
+      </w:r>
+      <w:r>
+        <w:rPr>
+          <w:sz w:val="21"/>
+        </w:rPr>
+        <w:t xml:space="preserve"> ⚡ Launch Attack Scenario trigger (APT29 Cozy Bear, FIN7 Ransomware, Insider Data Theft).</w:t>
+      </w:r>
+    </w:p>
+    <w:p>
+      <w:pPr>
+        <w:pStyle w:val="ListBullet2"/>
+      </w:pPr>
+      <w:r>
+        <w:rPr>
+          <w:b/>
+          <w:sz w:val="21"/>
+        </w:rPr>
+        <w:t>• Security Gate Authentication:</w:t>
+      </w:r>
+      <w:r>
+        <w:rPr>
+          <w:sz w:val="21"/>
+        </w:rPr>
+        <w:t xml:space="preserve"> Glassmorphism login gate modal with user profile dropdown.</w:t>
+      </w:r>
+    </w:p>
+    <w:p>
+      <w:r>
+        <w:br w:type="page"/>
+      </w:r>
+    </w:p>
+    <w:p>
+      <w:pPr>
+        <w:pStyle w:val="Heading1"/>
+        <w:jc w:val="left"/>
+      </w:pPr>
+      <w:r>
+        <w:rPr>
+          <w:b/>
+          <w:color w:val="0F172A"/>
+          <w:sz w:val="40"/>
+        </w:rPr>
+        <w:t>RESEARCH AND REFERENCES</w:t>
       </w:r>
     </w:p>
     <w:p>
@@ -494,405 +1120,97 @@
           <w:b/>
           <w:sz w:val="22"/>
         </w:rPr>
-        <w:t xml:space="preserve">Hierarchical Bayesian Blending: </w:t>
-      </w:r>
-      <w:r>
-        <w:rPr>
-          <w:sz w:val="22"/>
-        </w:rPr>
-        <w:t>Smoothly interpolates population priors (user vs service_account vs edge_device) and empirical stats, keeping cold-start FPR at 0.85%.</w:t>
+        <w:t>Details / Links of the reference and research work:</w:t>
       </w:r>
     </w:p>
     <w:p>
       <w:pPr>
-        <w:pStyle w:val="ListBullet"/>
+        <w:pStyle w:val="ListBullet2"/>
       </w:pPr>
       <w:r>
         <w:rPr>
           <w:b/>
-          <w:sz w:val="22"/>
+          <w:sz w:val="21"/>
         </w:rPr>
-        <w:t xml:space="preserve">EMA Concept Drift (alpha = 0.05): </w:t>
+        <w:t>• Isolation Forest Anomaly Detection:</w:t>
       </w:r>
       <w:r>
         <w:rPr>
-          <w:sz w:val="22"/>
+          <w:sz w:val="21"/>
         </w:rPr>
-        <w:t>Dynamically adapts non-anomalous entity centroids over time without re-training models.</w:t>
-      </w:r>
-    </w:p>
-    <w:p>
-      <w:r>
-        <w:br w:type="page"/>
+        <w:t xml:space="preserve"> Liu, F. T., Ting, K. M., &amp; Zhou, Z. H. (2008). Isolation Forest. IEEE International Conference on Data Mining (ICDM).</w:t>
       </w:r>
     </w:p>
     <w:p>
       <w:pPr>
-        <w:pStyle w:val="Heading1"/>
+        <w:pStyle w:val="ListBullet2"/>
       </w:pPr>
       <w:r>
         <w:rPr>
           <w:b/>
-          <w:color w:val="0F172A"/>
-          <w:sz w:val="32"/>
+          <w:sz w:val="21"/>
         </w:rPr>
-        <w:t>SLIDE 5: ARTIFACTS &amp; LIVE CLOUD DEPLOYMENT EVIDENCE</w:t>
+        <w:t>• LightGBM Gradient Boosting Framework:</w:t>
+      </w:r>
+      <w:r>
+        <w:rPr>
+          <w:sz w:val="21"/>
+        </w:rPr>
+        <w:t xml:space="preserve"> Ke, G., et al. (2017). LightGBM: A Highly Efficient Gradient Boosting Decision Tree. Advances in Neural Information Processing Systems (NeurIPS).</w:t>
       </w:r>
     </w:p>
     <w:p>
       <w:pPr>
-        <w:pStyle w:val="Heading2"/>
+        <w:pStyle w:val="ListBullet2"/>
       </w:pPr>
       <w:r>
-        <w:t>1. Live Cloud Production Deployments (Clickable Links)</w:t>
+        <w:rPr>
+          <w:b/>
+          <w:sz w:val="21"/>
+        </w:rPr>
+        <w:t>• SHAP Explainable AI Framework:</w:t>
+      </w:r>
+      <w:r>
+        <w:rPr>
+          <w:sz w:val="21"/>
+        </w:rPr>
+        <w:t xml:space="preserve"> Lundberg, S. M., &amp; Lee, S. I. (2017). A Unified Approach to Interpreting Model Predictions. NeurIPS.</w:t>
       </w:r>
     </w:p>
     <w:p>
       <w:pPr>
-        <w:pStyle w:val="ListBullet"/>
+        <w:pStyle w:val="ListBullet2"/>
       </w:pPr>
       <w:r>
         <w:rPr>
           <w:b/>
-          <w:sz w:val="22"/>
+          <w:sz w:val="21"/>
         </w:rPr>
-        <w:t xml:space="preserve">Live Vercel Frontend UI: </w:t>
+        <w:t>• MITRE ATT&amp;CK Framework:</w:t>
       </w:r>
       <w:r>
         <w:rPr>
-          <w:sz w:val="22"/>
+          <w:sz w:val="21"/>
         </w:rPr>
-        <w:t>https://behavior-iq-jade.vercel.app</w:t>
+        <w:t xml:space="preserve"> MITRE ATT&amp;CK Matrix for Enterprise &amp; Industrial Control Systems (ICS).</w:t>
       </w:r>
     </w:p>
     <w:p>
       <w:pPr>
-        <w:pStyle w:val="ListBullet"/>
+        <w:pStyle w:val="ListBullet2"/>
       </w:pPr>
       <w:r>
         <w:rPr>
           <w:b/>
-          <w:sz w:val="22"/>
+          <w:sz w:val="21"/>
         </w:rPr>
-        <w:t xml:space="preserve">Live Render FastAPI Backend: </w:t>
+        <w:t>• Security &amp; Compliance Standards:</w:t>
       </w:r>
       <w:r>
         <w:rPr>
-          <w:sz w:val="22"/>
+          <w:sz w:val="21"/>
         </w:rPr>
-        <w:t>https://behavior-iq.onrender.com</w:t>
-      </w:r>
-    </w:p>
-    <w:p>
-      <w:pPr>
-        <w:pStyle w:val="ListBullet"/>
-      </w:pPr>
-      <w:r>
-        <w:rPr>
-          <w:b/>
-          <w:sz w:val="22"/>
-        </w:rPr>
-        <w:t xml:space="preserve">Interactive Swagger API Docs: </w:t>
-      </w:r>
-      <w:r>
-        <w:rPr>
-          <w:sz w:val="22"/>
-        </w:rPr>
-        <w:t>https://behavior-iq.onrender.com/docs</w:t>
-      </w:r>
-    </w:p>
-    <w:p>
-      <w:pPr>
-        <w:pStyle w:val="ListBullet"/>
-      </w:pPr>
-      <w:r>
-        <w:rPr>
-          <w:b/>
-          <w:sz w:val="22"/>
-        </w:rPr>
-        <w:t xml:space="preserve">Open-Source GitHub Repository: </w:t>
-      </w:r>
-      <w:r>
-        <w:rPr>
-          <w:sz w:val="22"/>
-        </w:rPr>
-        <w:t>https://github.com/Yash-Singh607/Behavior-IQ</w:t>
-      </w:r>
-    </w:p>
-    <w:p>
-      <w:pPr>
-        <w:pStyle w:val="Heading2"/>
-      </w:pPr>
-      <w:r>
-        <w:t>2. Live Analyst Login Credentials (For Evaluator Testing)</w:t>
-      </w:r>
-    </w:p>
-    <w:p>
-      <w:pPr>
-        <w:pStyle w:val="ListBullet"/>
-      </w:pPr>
-      <w:r>
-        <w:rPr>
-          <w:b/>
-          <w:sz w:val="22"/>
-        </w:rPr>
-        <w:t xml:space="preserve">Analyst Login Email: </w:t>
-      </w:r>
-      <w:r>
-        <w:rPr>
-          <w:sz w:val="22"/>
-        </w:rPr>
-        <w:t>admin@behavioriq.ai</w:t>
-      </w:r>
-    </w:p>
-    <w:p>
-      <w:pPr>
-        <w:pStyle w:val="ListBullet"/>
-      </w:pPr>
-      <w:r>
-        <w:rPr>
-          <w:b/>
-          <w:sz w:val="22"/>
-        </w:rPr>
-        <w:t xml:space="preserve">Analyst Password: </w:t>
-      </w:r>
-      <w:r>
-        <w:rPr>
-          <w:sz w:val="22"/>
-        </w:rPr>
-        <w:t>admin123</w:t>
-      </w:r>
-    </w:p>
-    <w:p>
-      <w:pPr>
-        <w:pStyle w:val="ListBullet"/>
-      </w:pPr>
-      <w:r>
-        <w:rPr>
-          <w:b/>
-          <w:sz w:val="22"/>
-        </w:rPr>
-        <w:t xml:space="preserve">Role &amp; Access: </w:t>
-      </w:r>
-      <w:r>
-        <w:rPr>
-          <w:sz w:val="22"/>
-        </w:rPr>
-        <w:t>SOC Administrator &amp; Lead Behavioral Security Analyst</w:t>
-      </w:r>
-    </w:p>
-    <w:p>
-      <w:pPr>
-        <w:pStyle w:val="Heading2"/>
-      </w:pPr>
-      <w:r>
-        <w:t>3. Code &amp; Production Microservice Artifacts</w:t>
-      </w:r>
-    </w:p>
-    <w:p>
-      <w:pPr>
-        <w:pStyle w:val="ListBullet"/>
-      </w:pPr>
-      <w:r>
-        <w:rPr>
-          <w:b/>
-          <w:sz w:val="22"/>
-        </w:rPr>
-        <w:t xml:space="preserve">Containerization: </w:t>
-      </w:r>
-      <w:r>
-        <w:rPr>
-          <w:sz w:val="22"/>
-        </w:rPr>
-        <w:t>Dockerfile (512MB memory-optimized), docker-compose.yml (Orchestrating API, Redis Feature Store, and Apache Kafka Broker).</w:t>
-      </w:r>
-    </w:p>
-    <w:p>
-      <w:pPr>
-        <w:pStyle w:val="ListBullet"/>
-      </w:pPr>
-      <w:r>
-        <w:rPr>
-          <w:b/>
-          <w:sz w:val="22"/>
-        </w:rPr>
-        <w:t xml:space="preserve">Kubernetes Manifests: </w:t>
-      </w:r>
-      <w:r>
-        <w:rPr>
-          <w:sz w:val="22"/>
-        </w:rPr>
-        <w:t>Full production Kubernetes deployment, Service LoadBalancer, and Horizontal Pod Autoscaler (HPA) manifests (deploy/k8s/deployment.yaml).</w:t>
-      </w:r>
-    </w:p>
-    <w:p>
-      <w:pPr>
-        <w:pStyle w:val="Heading2"/>
-      </w:pPr>
-      <w:r>
-        <w:t>4. Interactive SOC Dashboard Features</w:t>
-      </w:r>
-    </w:p>
-    <w:p>
-      <w:pPr>
-        <w:pStyle w:val="ListBullet"/>
-      </w:pPr>
-      <w:r>
-        <w:rPr>
-          <w:b/>
-          <w:sz w:val="22"/>
-        </w:rPr>
-        <w:t xml:space="preserve">Real-Time Triage Desk: </w:t>
-      </w:r>
-      <w:r>
-        <w:rPr>
-          <w:sz w:val="22"/>
-        </w:rPr>
-        <w:t>Live incident queue table with SHAP feature attributions.</w:t>
-      </w:r>
-    </w:p>
-    <w:p>
-      <w:pPr>
-        <w:pStyle w:val="ListBullet"/>
-      </w:pPr>
-      <w:r>
-        <w:rPr>
-          <w:b/>
-          <w:sz w:val="22"/>
-        </w:rPr>
-        <w:t xml:space="preserve">Stage Threat Injector: </w:t>
-      </w:r>
-      <w:r>
-        <w:rPr>
-          <w:sz w:val="22"/>
-        </w:rPr>
-        <w:t>Interactive threat scenario simulator (Launch Attack Scenario).</w:t>
-      </w:r>
-    </w:p>
-    <w:p>
-      <w:pPr>
-        <w:pStyle w:val="ListBullet"/>
-      </w:pPr>
-      <w:r>
-        <w:rPr>
-          <w:b/>
-          <w:sz w:val="22"/>
-        </w:rPr>
-        <w:t xml:space="preserve">Real Security Gate: </w:t>
-      </w:r>
-      <w:r>
-        <w:rPr>
-          <w:sz w:val="22"/>
-        </w:rPr>
-        <w:t>Glassmorphism authentication gate modal with user profile dropdown.</w:t>
-      </w:r>
-    </w:p>
-    <w:p>
-      <w:r>
-        <w:br w:type="page"/>
-      </w:r>
-    </w:p>
-    <w:p>
-      <w:pPr>
-        <w:pStyle w:val="Heading1"/>
-      </w:pPr>
-      <w:r>
-        <w:rPr>
-          <w:b/>
-          <w:color w:val="0F172A"/>
-          <w:sz w:val="32"/>
-        </w:rPr>
-        <w:t>SLIDE 6: RESEARCH AND REFERENCES</w:t>
-      </w:r>
-    </w:p>
-    <w:p>
-      <w:pPr>
-        <w:pStyle w:val="ListBullet"/>
-      </w:pPr>
-      <w:r>
-        <w:rPr>
-          <w:b/>
-          <w:sz w:val="22"/>
-        </w:rPr>
-        <w:t xml:space="preserve">Isolation Forest Anomaly Detection: </w:t>
-      </w:r>
-      <w:r>
-        <w:rPr>
-          <w:sz w:val="22"/>
-        </w:rPr>
-        <w:t>Liu, F. T., Ting, K. M., &amp; Zhou, Z. H. (2008). Isolation Forest. IEEE International Conference on Data Mining (ICDM).</w:t>
-      </w:r>
-    </w:p>
-    <w:p>
-      <w:pPr>
-        <w:pStyle w:val="ListBullet"/>
-      </w:pPr>
-      <w:r>
-        <w:rPr>
-          <w:b/>
-          <w:sz w:val="22"/>
-        </w:rPr>
-        <w:t xml:space="preserve">LightGBM Gradient Boosting: </w:t>
-      </w:r>
-      <w:r>
-        <w:rPr>
-          <w:sz w:val="22"/>
-        </w:rPr>
-        <w:t>Ke, G., et al. (2017). LightGBM: A Highly Efficient Gradient Boosting Decision Tree. Advances in Neural Information Processing Systems (NeurIPS).</w:t>
-      </w:r>
-    </w:p>
-    <w:p>
-      <w:pPr>
-        <w:pStyle w:val="ListBullet"/>
-      </w:pPr>
-      <w:r>
-        <w:rPr>
-          <w:b/>
-          <w:sz w:val="22"/>
-        </w:rPr>
-        <w:t xml:space="preserve">SHAP Explainability: </w:t>
-      </w:r>
-      <w:r>
-        <w:rPr>
-          <w:sz w:val="22"/>
-        </w:rPr>
-        <w:t>Lundberg, S. M., &amp; Lee, S. I. (2017). A Unified Approach to Interpreting Model Predictions. NeurIPS.</w:t>
-      </w:r>
-    </w:p>
-    <w:p>
-      <w:pPr>
-        <w:pStyle w:val="ListBullet"/>
-      </w:pPr>
-      <w:r>
-        <w:rPr>
-          <w:b/>
-          <w:sz w:val="22"/>
-        </w:rPr>
-        <w:t xml:space="preserve">Cybersecurity Frameworks: </w:t>
-      </w:r>
-      <w:r>
-        <w:rPr>
-          <w:sz w:val="22"/>
-        </w:rPr>
-        <w:t>MITRE ATT&amp;CK Matrix for Enterprise &amp; ICS.</w:t>
-      </w:r>
-    </w:p>
-    <w:p>
-      <w:pPr>
-        <w:pStyle w:val="ListBullet"/>
-      </w:pPr>
-      <w:r>
-        <w:rPr>
-          <w:b/>
-          <w:sz w:val="22"/>
-        </w:rPr>
-        <w:t xml:space="preserve">Compliance Standards: </w:t>
-      </w:r>
-      <w:r>
-        <w:rPr>
-          <w:sz w:val="22"/>
-        </w:rPr>
-        <w:t>ISO/IEC 27001:2022, SOC 2 Type II, and GDPR Privacy Regulations.</w:t>
+        <w:t xml:space="preserve"> ISO/IEC 27001:2022, SOC 2 Type II, and GDPR Privacy Regulations.</w:t>
       </w:r>
     </w:p>
     <w:sectPr>

</xml_diff>

<commit_message>
Update Word document to strictly match exact unmodified PDF template structure and labels
</commit_message>
<xml_diff>
--- a/Honeywell_Idea_Submission_BehaviorIQ.docx
+++ b/Honeywell_Idea_Submission_BehaviorIQ.docx
@@ -5,7 +5,7 @@
     <w:p>
       <w:pPr>
         <w:pStyle w:val="Heading1"/>
-        <w:jc w:val="left"/>
+        <w:jc w:val="center"/>
       </w:pPr>
       <w:r>
         <w:rPr>
@@ -16,6 +16,7 @@
         <w:t>IMPORTANT INSTRUCTIONS</w:t>
       </w:r>
     </w:p>
+    <w:p/>
     <w:p>
       <w:r>
         <w:rPr>
@@ -29,11 +30,7 @@
         <w:pStyle w:val="ListBullet"/>
       </w:pPr>
       <w:r>
-        <w:rPr>
-          <w:b/>
-          <w:sz w:val="22"/>
-        </w:rPr>
-        <w:t>1. Kindly keep the maximum slides limit up to six (6). (Including the title slide)</w:t>
+        <w:t>1. Kindly keep the maximum slides limit up to six (6). ( Including the title slide)</w:t>
       </w:r>
     </w:p>
     <w:p>
@@ -41,11 +38,7 @@
         <w:pStyle w:val="ListBullet"/>
       </w:pPr>
       <w:r>
-        <w:rPr>
-          <w:b/>
-          <w:sz w:val="22"/>
-        </w:rPr>
-        <w:t>2. Try to avoid paragraphs and post your idea in points / diagrams / Infographics / pictures</w:t>
+        <w:t>2. Try to avoid paragraphs and post your idea in points /diagrams / Infographics /pictures</w:t>
       </w:r>
     </w:p>
     <w:p>
@@ -53,10 +46,6 @@
         <w:pStyle w:val="ListBullet"/>
       </w:pPr>
       <w:r>
-        <w:rPr>
-          <w:b/>
-          <w:sz w:val="22"/>
-        </w:rPr>
         <w:t>3. Keep your explanation precise and easy to understand</w:t>
       </w:r>
     </w:p>
@@ -65,10 +54,6 @@
         <w:pStyle w:val="ListBullet"/>
       </w:pPr>
       <w:r>
-        <w:rPr>
-          <w:b/>
-          <w:sz w:val="22"/>
-        </w:rPr>
         <w:t>4. Idea should be unique and novel.</w:t>
       </w:r>
     </w:p>
@@ -77,10 +62,6 @@
         <w:pStyle w:val="ListBullet"/>
       </w:pPr>
       <w:r>
-        <w:rPr>
-          <w:b/>
-          <w:sz w:val="22"/>
-        </w:rPr>
         <w:t>5. You can only use provided template for making the PPT without changing the idea details pointers (mentioned in previous slides).</w:t>
       </w:r>
     </w:p>
@@ -89,13 +70,10 @@
         <w:pStyle w:val="ListBullet"/>
       </w:pPr>
       <w:r>
-        <w:rPr>
-          <w:b/>
-          <w:sz w:val="22"/>
-        </w:rPr>
         <w:t>6. You need to save the file in PDF and upload the same on portal. No PPT, Word Doc or any other format will be supported.</w:t>
       </w:r>
     </w:p>
+    <w:p/>
     <w:p>
       <w:r>
         <w:rPr>
@@ -106,6 +84,19 @@
       </w:r>
     </w:p>
     <w:p>
+      <w:pPr>
+        <w:jc w:val="center"/>
+      </w:pPr>
+      <w:r>
+        <w:rPr>
+          <w:i/>
+          <w:color w:val="94A3B8"/>
+          <w:sz w:val="18"/>
+        </w:rPr>
+        <w:t>@SIH Idea submission- Template 1</w:t>
+      </w:r>
+    </w:p>
+    <w:p>
       <w:r>
         <w:br w:type="page"/>
       </w:r>
@@ -113,7 +104,7 @@
     <w:p>
       <w:pPr>
         <w:pStyle w:val="Heading1"/>
-        <w:jc w:val="left"/>
+        <w:jc w:val="center"/>
       </w:pPr>
       <w:r>
         <w:rPr>
@@ -124,6 +115,7 @@
         <w:t>TITLE PAGE</w:t>
       </w:r>
     </w:p>
+    <w:p/>
     <w:p>
       <w:pPr>
         <w:pStyle w:val="ListBullet"/>
@@ -131,15 +123,9 @@
       <w:r>
         <w:rPr>
           <w:b/>
-          <w:sz w:val="22"/>
+          <w:sz w:val="23"/>
         </w:rPr>
-        <w:t>Problem Statement ID –</w:t>
-      </w:r>
-      <w:r>
-        <w:rPr>
-          <w:sz w:val="22"/>
-        </w:rPr>
-        <w:t xml:space="preserve"> [Insert Your PS ID e.g., SIH1234 / HW_SEC_01]</w:t>
+        <w:t>Problem Statement ID – [Insert Your PS ID e.g. SIH1234 / HW_SEC_01]</w:t>
       </w:r>
     </w:p>
     <w:p>
@@ -149,15 +135,9 @@
       <w:r>
         <w:rPr>
           <w:b/>
-          <w:sz w:val="22"/>
+          <w:sz w:val="23"/>
         </w:rPr>
-        <w:t>Problem Statement Title-</w:t>
-      </w:r>
-      <w:r>
-        <w:rPr>
-          <w:sz w:val="22"/>
-        </w:rPr>
-        <w:t xml:space="preserve"> Autonomous Behavioral Anomaly Detection &amp; Threat SOC Engine for Enterprise IT &amp; Industrial OT</w:t>
+        <w:t>Problem Statement Title- Autonomous Behavioral Anomaly Detection &amp; Threat SOC Engine for Enterprise IT &amp; Industrial OT</w:t>
       </w:r>
     </w:p>
     <w:p>
@@ -167,15 +147,9 @@
       <w:r>
         <w:rPr>
           <w:b/>
-          <w:sz w:val="22"/>
+          <w:sz w:val="23"/>
         </w:rPr>
-        <w:t>Theme-</w:t>
-      </w:r>
-      <w:r>
-        <w:rPr>
-          <w:sz w:val="22"/>
-        </w:rPr>
-        <w:t xml:space="preserve"> Cybersecurity / AI &amp; ML / Smart Industrial Automation</w:t>
+        <w:t>Theme- Cybersecurity / AI &amp; ML / Smart Industrial Automation</w:t>
       </w:r>
     </w:p>
     <w:p>
@@ -185,15 +159,9 @@
       <w:r>
         <w:rPr>
           <w:b/>
-          <w:sz w:val="22"/>
+          <w:sz w:val="23"/>
         </w:rPr>
-        <w:t>PS Category-</w:t>
-      </w:r>
-      <w:r>
-        <w:rPr>
-          <w:sz w:val="22"/>
-        </w:rPr>
-        <w:t xml:space="preserve"> Software</w:t>
+        <w:t>PS Category- Software</w:t>
       </w:r>
     </w:p>
     <w:p>
@@ -203,15 +171,9 @@
       <w:r>
         <w:rPr>
           <w:b/>
-          <w:sz w:val="22"/>
+          <w:sz w:val="23"/>
         </w:rPr>
-        <w:t>Student Name (Registered on portal)-</w:t>
-      </w:r>
-      <w:r>
-        <w:rPr>
-          <w:sz w:val="22"/>
-        </w:rPr>
-        <w:t xml:space="preserve"> Yash Singh</w:t>
+        <w:t>Student Name (Registered on portal)- Yash Singh</w:t>
       </w:r>
     </w:p>
     <w:p>
@@ -221,15 +183,22 @@
       <w:r>
         <w:rPr>
           <w:b/>
-          <w:sz w:val="22"/>
+          <w:sz w:val="23"/>
         </w:rPr>
-        <w:t>Student ID-</w:t>
+        <w:t>Student ID- [Insert Your Registered Portal Student ID]</w:t>
       </w:r>
+    </w:p>
+    <w:p>
+      <w:pPr>
+        <w:jc w:val="center"/>
+      </w:pPr>
       <w:r>
         <w:rPr>
-          <w:sz w:val="22"/>
+          <w:i/>
+          <w:color w:val="94A3B8"/>
+          <w:sz w:val="18"/>
         </w:rPr>
-        <w:t xml:space="preserve"> [Insert Your Registered Portal Student ID]</w:t>
+        <w:t>@SIH Idea submission- Template 2</w:t>
       </w:r>
     </w:p>
     <w:p>
@@ -240,7 +209,7 @@
     <w:p>
       <w:pPr>
         <w:pStyle w:val="Heading1"/>
-        <w:jc w:val="left"/>
+        <w:jc w:val="center"/>
       </w:pPr>
       <w:r>
         <w:rPr>
@@ -251,11 +220,12 @@
         <w:t>IDEA TITLE: BehaviorIQ</w:t>
       </w:r>
     </w:p>
+    <w:p/>
     <w:p>
       <w:r>
         <w:rPr>
           <w:b/>
-          <w:sz w:val="28"/>
+          <w:sz w:val="26"/>
           <w:u w:val="single"/>
         </w:rPr>
         <w:t>Proposed Solution (Describe your Idea/Solution/Prototype)</w:t>
@@ -268,9 +238,9 @@
       <w:r>
         <w:rPr>
           <w:b/>
-          <w:sz w:val="22"/>
+          <w:sz w:val="23"/>
         </w:rPr>
-        <w:t>Detailed explanation of the proposed solution:</w:t>
+        <w:t>Detailed explanation of the proposed solution</w:t>
       </w:r>
     </w:p>
     <w:p>
@@ -282,13 +252,13 @@
           <w:b/>
           <w:sz w:val="21"/>
         </w:rPr>
-        <w:t>• Autonomous Behavioral SOC Engine:</w:t>
+        <w:t>• BehaviorIQ Engine:</w:t>
       </w:r>
       <w:r>
         <w:rPr>
           <w:sz w:val="21"/>
         </w:rPr>
-        <w:t xml:space="preserve"> Replaces static SIEM alert rules with dynamic, per-entity machine learning baselines to detect novel zero-day intrusions.</w:t>
+        <w:t xml:space="preserve"> Autonomous AI-powered Security Operations Center (SOC) engine replacing static SIEM alert rules with dynamic, per-entity machine learning baselines.</w:t>
       </w:r>
     </w:p>
     <w:p>
@@ -300,13 +270,13 @@
           <w:b/>
           <w:sz w:val="21"/>
         </w:rPr>
-        <w:t>• Dual-Stage ML Architecture:</w:t>
+        <w:t>• Dual-Stage ML Core:</w:t>
       </w:r>
       <w:r>
         <w:rPr>
           <w:sz w:val="21"/>
         </w:rPr>
-        <w:t xml:space="preserve"> Combines an Unsupervised Isolation Forest Profiler (5,000 decision trees) for anomaly scoring [0-100] with a Multi-Class LightGBM Classifier for threat taxonomy assignment.</w:t>
+        <w:t xml:space="preserve"> Unsupervised Isolation Forest (5,000 decision trees) for anomaly scoring [0-100] paired with a Multi-Class LightGBM Classifier for threat taxonomy assignment.</w:t>
       </w:r>
     </w:p>
     <w:p>
@@ -324,7 +294,7 @@
         <w:rPr>
           <w:sz w:val="21"/>
         </w:rPr>
-        <w:t xml:space="preserve"> Provides SHAP feature attribution leaderboards and natural-language forensic narratives for every flagged alert.</w:t>
+        <w:t xml:space="preserve"> Calculates SHAP feature attributions and generates natural-language forensic narratives for every flagged alert.</w:t>
       </w:r>
     </w:p>
     <w:p>
@@ -334,9 +304,9 @@
       <w:r>
         <w:rPr>
           <w:b/>
-          <w:sz w:val="22"/>
+          <w:sz w:val="23"/>
         </w:rPr>
-        <w:t>How it addresses the problem:</w:t>
+        <w:t>How it addresses the problem</w:t>
       </w:r>
     </w:p>
     <w:p>
@@ -348,13 +318,13 @@
           <w:b/>
           <w:sz w:val="21"/>
         </w:rPr>
-        <w:t>• Eliminates SOC Alert Fatigue:</w:t>
+        <w:t>• 99% Noise Reduction:</w:t>
       </w:r>
       <w:r>
         <w:rPr>
           <w:sz w:val="21"/>
         </w:rPr>
-        <w:t xml:space="preserve"> Enforces a strict Top 1% Alert Budget (&gt;= 75.0 Risk Score), filtering out 99% of benign false positive noise.</w:t>
+        <w:t xml:space="preserve"> Enforces a strict Top 1% Alert Budget (&gt;= 75.0 Risk Score), eliminating analyst alert fatigue.</w:t>
       </w:r>
     </w:p>
     <w:p>
@@ -366,13 +336,13 @@
           <w:b/>
           <w:sz w:val="21"/>
         </w:rPr>
-        <w:t>• Sub-Second Mitigation Response:</w:t>
+        <w:t>• Sub-Second Mitigation:</w:t>
       </w:r>
       <w:r>
         <w:rPr>
           <w:sz w:val="21"/>
         </w:rPr>
-        <w:t xml:space="preserve"> Executes autonomous playbooks (Cloudflare WAF IP quarantine, OAuth2 token revocation, mandatory MFA) in &lt; 0.38 seconds.</w:t>
+        <w:t xml:space="preserve"> Executes autonomous playbooks (Cloudflare WAF IP quarantine, OAuth2 session token revocation, mandatory MFA) in &lt;0.38 seconds.</w:t>
       </w:r>
     </w:p>
     <w:p>
@@ -384,13 +354,13 @@
           <w:b/>
           <w:sz w:val="21"/>
         </w:rPr>
-        <w:t>• Solves Edge Cases:</w:t>
+        <w:t>• Edge Case Mastery:</w:t>
       </w:r>
       <w:r>
         <w:rPr>
           <w:sz w:val="21"/>
         </w:rPr>
-        <w:t xml:space="preserve"> Employs Hierarchical Bayesian Blending for Cold-Start entities (N &lt; 20 events) and Exponential Moving Average (EMA alpha = 0.05) for Concept Drift adaptation.</w:t>
+        <w:t xml:space="preserve"> Solves Cold-Start entities (N &lt; 20 events) via Hierarchical Bayesian Blending (0.85% FPR) and Concept Drift via EMA (alpha = 0.05).</w:t>
       </w:r>
     </w:p>
     <w:p>
@@ -400,9 +370,9 @@
       <w:r>
         <w:rPr>
           <w:b/>
-          <w:sz w:val="22"/>
+          <w:sz w:val="23"/>
         </w:rPr>
-        <w:t>Innovation and uniqueness of the solution:</w:t>
+        <w:t>Innovation and uniqueness of the solution</w:t>
       </w:r>
     </w:p>
     <w:p>
@@ -414,13 +384,13 @@
           <w:b/>
           <w:sz w:val="21"/>
         </w:rPr>
-        <w:t>• Real-Time Geo-Velocity Tracking:</w:t>
+        <w:t>• Real-Time Geo-Velocity:</w:t>
       </w:r>
       <w:r>
         <w:rPr>
           <w:sz w:val="21"/>
         </w:rPr>
-        <w:t xml:space="preserve"> Calculates physical travel speed (&gt; 840 km/h) between consecutive access tokens to stop impossible travel intrusions.</w:t>
+        <w:t xml:space="preserve"> Calculates physical travel speed (&gt; 840 km/h) between consecutive access tokens to stop impossible travel attacks.</w:t>
       </w:r>
     </w:p>
     <w:p>
@@ -432,13 +402,26 @@
           <w:b/>
           <w:sz w:val="21"/>
         </w:rPr>
-        <w:t>• Dark Web Intelligence Integration:</w:t>
+        <w:t>• Dark Web Intelligence:</w:t>
       </w:r>
       <w:r>
         <w:rPr>
           <w:sz w:val="21"/>
         </w:rPr>
-        <w:t xml:space="preserve"> Live cross-referencing of entity session tokens against active dark web credential dumps and breach databases.</w:t>
+        <w:t xml:space="preserve"> Live cross-referencing of entity tokens against active dark web credential dumps.</w:t>
+      </w:r>
+    </w:p>
+    <w:p>
+      <w:pPr>
+        <w:jc w:val="center"/>
+      </w:pPr>
+      <w:r>
+        <w:rPr>
+          <w:i/>
+          <w:color w:val="94A3B8"/>
+          <w:sz w:val="18"/>
+        </w:rPr>
+        <w:t>@SIH Idea submission- Template 3</w:t>
       </w:r>
     </w:p>
     <w:p>
@@ -449,7 +432,7 @@
     <w:p>
       <w:pPr>
         <w:pStyle w:val="Heading1"/>
-        <w:jc w:val="left"/>
+        <w:jc w:val="center"/>
       </w:pPr>
       <w:r>
         <w:rPr>
@@ -460,6 +443,7 @@
         <w:t>TECHNICAL APPROACH</w:t>
       </w:r>
     </w:p>
+    <w:p/>
     <w:p>
       <w:pPr>
         <w:pStyle w:val="ListBullet"/>
@@ -467,9 +451,9 @@
       <w:r>
         <w:rPr>
           <w:b/>
-          <w:sz w:val="22"/>
+          <w:sz w:val="23"/>
         </w:rPr>
-        <w:t>Technologies to be used (e.g. programming languages, frameworks, hardware):</w:t>
+        <w:t>Technologies to be used (e.g. programming languages, frameworks, hardware)</w:t>
       </w:r>
     </w:p>
     <w:p>
@@ -481,7 +465,7 @@
           <w:b/>
           <w:sz w:val="21"/>
         </w:rPr>
-        <w:t>• Languages &amp; Backend Frameworks:</w:t>
+        <w:t>• Programming &amp; Frameworks:</w:t>
       </w:r>
       <w:r>
         <w:rPr>
@@ -499,13 +483,13 @@
           <w:b/>
           <w:sz w:val="21"/>
         </w:rPr>
-        <w:t>• Machine Learning &amp; Explainability:</w:t>
+        <w:t>• ML &amp; Explainability:</w:t>
       </w:r>
       <w:r>
         <w:rPr>
           <w:sz w:val="21"/>
         </w:rPr>
-        <w:t xml:space="preserve"> Scikit-Learn (Isolation Forest), LightGBM (Multi-Class Gradient Boosting), SHAP (SHapley Additive exPlanations), NumPy, Pandas.</w:t>
+        <w:t xml:space="preserve"> Scikit-Learn (Isolation Forest), LightGBM (Multi-Class Gradient Boosting), SHAP (XAI), NumPy, Pandas.</w:t>
       </w:r>
     </w:p>
     <w:p>
@@ -517,7 +501,7 @@
           <w:b/>
           <w:sz w:val="21"/>
         </w:rPr>
-        <w:t>• Distributed Streaming &amp; Storage:</w:t>
+        <w:t>• Ingestion &amp; Cache:</w:t>
       </w:r>
       <w:r>
         <w:rPr>
@@ -553,13 +537,13 @@
           <w:b/>
           <w:sz w:val="21"/>
         </w:rPr>
-        <w:t>• Cloud &amp; Orchestration:</w:t>
+        <w:t>• Microservices &amp; Cloud:</w:t>
       </w:r>
       <w:r>
         <w:rPr>
           <w:sz w:val="21"/>
         </w:rPr>
-        <w:t xml:space="preserve"> Docker, Docker Compose, Kubernetes HPA (Autoscaling), Vercel (Frontend), Render (Backend).</w:t>
+        <w:t xml:space="preserve"> Docker, Docker Compose, Kubernetes HPA, Vercel (Frontend), Render (Backend).</w:t>
       </w:r>
     </w:p>
     <w:p>
@@ -569,9 +553,9 @@
       <w:r>
         <w:rPr>
           <w:b/>
-          <w:sz w:val="22"/>
+          <w:sz w:val="23"/>
         </w:rPr>
-        <w:t>Methodology and process for implementation (Flow Charts/Images/ working prototype):</w:t>
+        <w:t>Methodology and process for implementation (Flow Charts/Images/ working prototype)</w:t>
       </w:r>
     </w:p>
     <w:p>
@@ -583,13 +567,13 @@
           <w:b/>
           <w:sz w:val="21"/>
         </w:rPr>
-        <w:t>• Ingestion &amp; Feature Engineering Pipeline:</w:t>
+        <w:t>1. Ingestion &amp; Feature Extraction:</w:t>
       </w:r>
       <w:r>
         <w:rPr>
           <w:sz w:val="21"/>
         </w:rPr>
-        <w:t xml:space="preserve"> Access Stream Logs ➔ Extract Geo-Velocity, Failed Login Bursts, Device Hash ➔ Stateful Feature Matrix.</w:t>
+        <w:t xml:space="preserve"> Access Logs Stream (1,420 eps) ➔ Extract Geo-Velocity, Failed Login Bursts, Device Fingerprints.</w:t>
       </w:r>
     </w:p>
     <w:p>
@@ -601,13 +585,13 @@
           <w:b/>
           <w:sz w:val="21"/>
         </w:rPr>
-        <w:t>• Unsupervised Profiling &amp; Scoring:</w:t>
+        <w:t>2. Profiling &amp; Scoring:</w:t>
       </w:r>
       <w:r>
         <w:rPr>
           <w:sz w:val="21"/>
         </w:rPr>
-        <w:t xml:space="preserve"> Feature Matrix ➔ Isolation Forest (5,000 Trees) ➔ Normalized Anomaly Score [0-100].</w:t>
+        <w:t xml:space="preserve"> Feature Matrix ➔ Isolation Forest Profiler (5,000 Trees) ➔ Anomaly Score [0-100].</w:t>
       </w:r>
     </w:p>
     <w:p>
@@ -619,13 +603,13 @@
           <w:b/>
           <w:sz w:val="21"/>
         </w:rPr>
-        <w:t>• Top 1% Alert Budget Filter:</w:t>
+        <w:t>3. Alert Budget Filter:</w:t>
       </w:r>
       <w:r>
         <w:rPr>
           <w:sz w:val="21"/>
         </w:rPr>
-        <w:t xml:space="preserve"> Score &gt;= 75.0 ? Flag Threat : Update EMA Baseline Profile (alpha = 0.05).</w:t>
+        <w:t xml:space="preserve"> Risk Score &gt;= 75.0 ? Flag Threat : Update EMA Baseline Profile (alpha = 0.05).</w:t>
       </w:r>
     </w:p>
     <w:p>
@@ -637,13 +621,13 @@
           <w:b/>
           <w:sz w:val="21"/>
         </w:rPr>
-        <w:t>• Classification &amp; Explainability:</w:t>
+        <w:t>4. Classification &amp; XAI:</w:t>
       </w:r>
       <w:r>
         <w:rPr>
           <w:sz w:val="21"/>
         </w:rPr>
-        <w:t xml:space="preserve"> Flagged Anomaly ➔ LightGBM Classifier ➔ SHAP Feature Importance Attribution ➔ Analyst Triage Desk.</w:t>
+        <w:t xml:space="preserve"> Flagged Incident ➔ LightGBM Classifier ➔ SHAP Feature Importance Attribution ➔ Triage Desk.</w:t>
       </w:r>
     </w:p>
     <w:p>
@@ -655,13 +639,26 @@
           <w:b/>
           <w:sz w:val="21"/>
         </w:rPr>
-        <w:t>• Autonomous SOAR Playbook:</w:t>
+        <w:t>5. Autonomous SOAR:</w:t>
       </w:r>
       <w:r>
         <w:rPr>
           <w:sz w:val="21"/>
         </w:rPr>
-        <w:t xml:space="preserve"> High Confidence Threat ➔ Execute Cloudflare WAF IP Block &amp; OAuth Token Revocation (&lt;0.38s).</w:t>
+        <w:t xml:space="preserve"> High Confidence Threat ➔ Execute Cloudflare WAF Block &amp; OAuth Token Revocation (&lt;0.38s).</w:t>
+      </w:r>
+    </w:p>
+    <w:p>
+      <w:pPr>
+        <w:jc w:val="center"/>
+      </w:pPr>
+      <w:r>
+        <w:rPr>
+          <w:i/>
+          <w:color w:val="94A3B8"/>
+          <w:sz w:val="18"/>
+        </w:rPr>
+        <w:t>@SIH Idea submission- Template 4</w:t>
       </w:r>
     </w:p>
     <w:p>
@@ -672,7 +669,7 @@
     <w:p>
       <w:pPr>
         <w:pStyle w:val="Heading1"/>
-        <w:jc w:val="left"/>
+        <w:jc w:val="center"/>
       </w:pPr>
       <w:r>
         <w:rPr>
@@ -683,6 +680,7 @@
         <w:t>FEASIBILITY AND VIABILITY</w:t>
       </w:r>
     </w:p>
+    <w:p/>
     <w:p>
       <w:pPr>
         <w:pStyle w:val="ListBullet"/>
@@ -690,9 +688,9 @@
       <w:r>
         <w:rPr>
           <w:b/>
-          <w:sz w:val="22"/>
+          <w:sz w:val="23"/>
         </w:rPr>
-        <w:t>Analysis of the feasibility of the idea:</w:t>
+        <w:t>Analysis of the feasibility of the idea</w:t>
       </w:r>
     </w:p>
     <w:p>
@@ -704,7 +702,7 @@
           <w:b/>
           <w:sz w:val="21"/>
         </w:rPr>
-        <w:t>• Empirical ML Benchmark Scores:</w:t>
+        <w:t>• ML Benchmark Accuracy:</w:t>
       </w:r>
       <w:r>
         <w:rPr>
@@ -722,13 +720,13 @@
           <w:b/>
           <w:sz w:val="21"/>
         </w:rPr>
-        <w:t>• Real-Time Latency Benchmark:</w:t>
+        <w:t>• Real-Time Latency:</w:t>
       </w:r>
       <w:r>
         <w:rPr>
           <w:sz w:val="21"/>
         </w:rPr>
-        <w:t xml:space="preserve"> Model inference completes in &lt; 0.8ms per event, handling &gt; 12,000 events/sec throughput.</w:t>
+        <w:t xml:space="preserve"> Inference completes in &lt;0.8ms per event, handling &gt;12,000 events/sec throughput.</w:t>
       </w:r>
     </w:p>
     <w:p>
@@ -740,13 +738,13 @@
           <w:b/>
           <w:sz w:val="21"/>
         </w:rPr>
-        <w:t>• False Positive Rate Target:</w:t>
+        <w:t>• Alert Budget Control:</w:t>
       </w:r>
       <w:r>
         <w:rPr>
           <w:sz w:val="21"/>
         </w:rPr>
-        <w:t xml:space="preserve"> Top 1% Alert Budget enforcement maintains FPR &lt; 0.32%, well below the industry standard limit.</w:t>
+        <w:t xml:space="preserve"> Top 1% cutoff maintains False Positive Rate &lt; 0.32%.</w:t>
       </w:r>
     </w:p>
     <w:p>
@@ -756,9 +754,9 @@
       <w:r>
         <w:rPr>
           <w:b/>
-          <w:sz w:val="22"/>
+          <w:sz w:val="23"/>
         </w:rPr>
-        <w:t>Potential challenges and risks:</w:t>
+        <w:t>Potential challenges and risks</w:t>
       </w:r>
     </w:p>
     <w:p>
@@ -776,7 +774,7 @@
         <w:rPr>
           <w:sz w:val="21"/>
         </w:rPr>
-        <w:t xml:space="preserve"> Newly onboarded users or IoT devices (N &lt; 20 events) lack behavioral history, risking false positive storms.</w:t>
+        <w:t xml:space="preserve"> Newly onboarded users or IoT edge devices (N &lt; 20 events) lacking historical baselines, risking false positive storms.</w:t>
       </w:r>
     </w:p>
     <w:p>
@@ -794,7 +792,7 @@
         <w:rPr>
           <w:sz w:val="21"/>
         </w:rPr>
-        <w:t xml:space="preserve"> Legitimate evolving employee behavior (e.g. shift change) causing false baseline drift over time.</w:t>
+        <w:t xml:space="preserve"> Evolving employee shift patterns causing baseline drift over time.</w:t>
       </w:r>
     </w:p>
     <w:p>
@@ -804,9 +802,9 @@
       <w:r>
         <w:rPr>
           <w:b/>
-          <w:sz w:val="22"/>
+          <w:sz w:val="23"/>
         </w:rPr>
-        <w:t>Strategies for overcoming these challenges:</w:t>
+        <w:t>Strategies for overcoming these challenges</w:t>
       </w:r>
     </w:p>
     <w:p>
@@ -824,7 +822,7 @@
         <w:rPr>
           <w:sz w:val="21"/>
         </w:rPr>
-        <w:t xml:space="preserve"> Blends population priors (user vs service_account vs edge_device) with empirical stats, reducing cold-start FPR to 0.85%.</w:t>
+        <w:t xml:space="preserve"> Interpolates population priors (user vs service_account vs edge_device) with empirical stats, reducing cold-start FPR to 0.85%.</w:t>
       </w:r>
     </w:p>
     <w:p>
@@ -842,7 +840,20 @@
         <w:rPr>
           <w:sz w:val="21"/>
         </w:rPr>
-        <w:t xml:space="preserve"> Continuously updates non-anomalous baseline centroids without requiring expensive full-model retraining.</w:t>
+        <w:t xml:space="preserve"> Dynamically updates non-anomalous entity centroids over time without requiring expensive model retraining.</w:t>
+      </w:r>
+    </w:p>
+    <w:p>
+      <w:pPr>
+        <w:jc w:val="center"/>
+      </w:pPr>
+      <w:r>
+        <w:rPr>
+          <w:i/>
+          <w:color w:val="94A3B8"/>
+          <w:sz w:val="18"/>
+        </w:rPr>
+        <w:t>@SIH Idea submission- Template 5</w:t>
       </w:r>
     </w:p>
     <w:p>
@@ -853,7 +864,7 @@
     <w:p>
       <w:pPr>
         <w:pStyle w:val="Heading1"/>
-        <w:jc w:val="left"/>
+        <w:jc w:val="center"/>
       </w:pPr>
       <w:r>
         <w:rPr>
@@ -864,6 +875,7 @@
         <w:t>ARTIFACTS</w:t>
       </w:r>
     </w:p>
+    <w:p/>
     <w:p>
       <w:pPr>
         <w:pStyle w:val="ListBullet"/>
@@ -871,7 +883,7 @@
       <w:r>
         <w:rPr>
           <w:b/>
-          <w:sz w:val="22"/>
+          <w:sz w:val="23"/>
         </w:rPr>
         <w:t>Relevant artifacts, such as :</w:t>
       </w:r>
@@ -883,9 +895,9 @@
       <w:r>
         <w:rPr>
           <w:b/>
-          <w:sz w:val="22"/>
+          <w:sz w:val="23"/>
         </w:rPr>
-        <w:t>Copy of the Code Embedded:</w:t>
+        <w:t>Copy of the Code Embedded</w:t>
       </w:r>
     </w:p>
     <w:p>
@@ -915,7 +927,7 @@
           <w:b/>
           <w:sz w:val="21"/>
         </w:rPr>
-        <w:t>• Containerization:</w:t>
+        <w:t>• Production Containers:</w:t>
       </w:r>
       <w:r>
         <w:rPr>
@@ -939,7 +951,7 @@
         <w:rPr>
           <w:sz w:val="21"/>
         </w:rPr>
-        <w:t xml:space="preserve"> deploy/k8s/deployment.yaml (Deployment, LoadBalancer Service, Horizontal Pod Autoscaler).</w:t>
+        <w:t xml:space="preserve"> deploy/k8s/deployment.yaml (Deployment, Service LoadBalancer, Horizontal Pod Autoscaler).</w:t>
       </w:r>
     </w:p>
     <w:p>
@@ -949,9 +961,9 @@
       <w:r>
         <w:rPr>
           <w:b/>
-          <w:sz w:val="22"/>
+          <w:sz w:val="23"/>
         </w:rPr>
-        <w:t>Snaps of the solution proposal &amp; Live Cloud Links:</w:t>
+        <w:t>Snaps of the solution proposal</w:t>
       </w:r>
     </w:p>
     <w:p>
@@ -1017,7 +1029,7 @@
           <w:b/>
           <w:sz w:val="21"/>
         </w:rPr>
-        <w:t>• Live Analyst Testing Credentials:</w:t>
+        <w:t>• Analyst Login Credentials:</w:t>
       </w:r>
       <w:r>
         <w:rPr>
@@ -1033,9 +1045,9 @@
       <w:r>
         <w:rPr>
           <w:b/>
-          <w:sz w:val="22"/>
+          <w:sz w:val="23"/>
         </w:rPr>
-        <w:t>Dashboard snaps:</w:t>
+        <w:t>Dashboard snaps</w:t>
       </w:r>
     </w:p>
     <w:p>
@@ -1047,13 +1059,13 @@
           <w:b/>
           <w:sz w:val="21"/>
         </w:rPr>
-        <w:t>• Real-Time Incident Triage Desk:</w:t>
+        <w:t>• Incident Triage Workbench:</w:t>
       </w:r>
       <w:r>
         <w:rPr>
           <w:sz w:val="21"/>
         </w:rPr>
-        <w:t xml:space="preserve"> Interactive triage stream table with SHAP feature attributions.</w:t>
+        <w:t xml:space="preserve"> Real-time triage stream table with SHAP feature attributions.</w:t>
       </w:r>
     </w:p>
     <w:p>
@@ -1065,7 +1077,7 @@
           <w:b/>
           <w:sz w:val="21"/>
         </w:rPr>
-        <w:t>• Stage Threat Injection Simulator:</w:t>
+        <w:t>• Stage Threat Injector:</w:t>
       </w:r>
       <w:r>
         <w:rPr>
@@ -1093,6 +1105,19 @@
       </w:r>
     </w:p>
     <w:p>
+      <w:pPr>
+        <w:jc w:val="center"/>
+      </w:pPr>
+      <w:r>
+        <w:rPr>
+          <w:i/>
+          <w:color w:val="94A3B8"/>
+          <w:sz w:val="18"/>
+        </w:rPr>
+        <w:t>@SIH Idea submission- Template 6</w:t>
+      </w:r>
+    </w:p>
+    <w:p>
       <w:r>
         <w:br w:type="page"/>
       </w:r>
@@ -1100,7 +1125,7 @@
     <w:p>
       <w:pPr>
         <w:pStyle w:val="Heading1"/>
-        <w:jc w:val="left"/>
+        <w:jc w:val="center"/>
       </w:pPr>
       <w:r>
         <w:rPr>
@@ -1111,6 +1136,7 @@
         <w:t>RESEARCH AND REFERENCES</w:t>
       </w:r>
     </w:p>
+    <w:p/>
     <w:p>
       <w:pPr>
         <w:pStyle w:val="ListBullet"/>
@@ -1118,9 +1144,9 @@
       <w:r>
         <w:rPr>
           <w:b/>
-          <w:sz w:val="22"/>
+          <w:sz w:val="23"/>
         </w:rPr>
-        <w:t>Details / Links of the reference and research work:</w:t>
+        <w:t>Details / Links of the reference and research work</w:t>
       </w:r>
     </w:p>
     <w:p>
@@ -1204,13 +1230,26 @@
           <w:b/>
           <w:sz w:val="21"/>
         </w:rPr>
-        <w:t>• Security &amp; Compliance Standards:</w:t>
+        <w:t>• Compliance Standards:</w:t>
       </w:r>
       <w:r>
         <w:rPr>
           <w:sz w:val="21"/>
         </w:rPr>
-        <w:t xml:space="preserve"> ISO/IEC 27001:2022, SOC 2 Type II, and GDPR Privacy Regulations.</w:t>
+        <w:t xml:space="preserve"> ISO/IEC 27001:2022, SOC 2 Type II, and GDPR Privacy Controls.</w:t>
+      </w:r>
+    </w:p>
+    <w:p>
+      <w:pPr>
+        <w:jc w:val="center"/>
+      </w:pPr>
+      <w:r>
+        <w:rPr>
+          <w:i/>
+          <w:color w:val="94A3B8"/>
+          <w:sz w:val="18"/>
+        </w:rPr>
+        <w:t>@SIH Idea submission- Template 7</w:t>
       </w:r>
     </w:p>
     <w:sectPr>

</xml_diff>